<commit_message>
Added GitHub Stacked PRs
</commit_message>
<xml_diff>
--- a/git1_and_github_commands_documentary.docx
+++ b/git1_and_github_commands_documentary.docx
@@ -19,9 +19,8 @@
           <w:sz w:val="40"/>
           <w:szCs w:val="40"/>
         </w:rPr>
-        <w:t xml:space="preserve">Git and </w:t>
-      </w:r>
-      <w:proofErr w:type="spellStart"/>
+        <w:t>Git and Git</w:t>
+      </w:r>
       <w:r>
         <w:rPr>
           <w:b/>
@@ -29,9 +28,8 @@
           <w:sz w:val="40"/>
           <w:szCs w:val="40"/>
         </w:rPr>
-        <w:t>Github</w:t>
-      </w:r>
-      <w:proofErr w:type="spellEnd"/>
+        <w:t>H</w:t>
+      </w:r>
       <w:r>
         <w:rPr>
           <w:b/>
@@ -39,7 +37,7 @@
           <w:sz w:val="40"/>
           <w:szCs w:val="40"/>
         </w:rPr>
-        <w:t xml:space="preserve"> commands</w:t>
+        <w:t>ub commands</w:t>
       </w:r>
     </w:p>
     <w:p>
@@ -3964,6 +3962,28 @@
       <w:pPr>
         <w:jc w:val="both"/>
         <w:rPr>
+          <w:b/>
+          <w:bCs/>
+          <w:color w:val="000000" w:themeColor="text1"/>
+          <w:sz w:val="32"/>
+          <w:szCs w:val="32"/>
+        </w:rPr>
+      </w:pPr>
+      <w:r>
+        <w:rPr>
+          <w:b/>
+          <w:bCs/>
+          <w:color w:val="000000" w:themeColor="text1"/>
+          <w:sz w:val="32"/>
+          <w:szCs w:val="32"/>
+        </w:rPr>
+        <w:t>|          |             |           |</w:t>
+      </w:r>
+    </w:p>
+    <w:p>
+      <w:pPr>
+        <w:jc w:val="both"/>
+        <w:rPr>
           <w:color w:val="000000" w:themeColor="text1"/>
           <w:sz w:val="32"/>
           <w:szCs w:val="32"/>
@@ -4069,6 +4089,7 @@
           <w:sz w:val="32"/>
           <w:szCs w:val="32"/>
         </w:rPr>
+        <w:lastRenderedPageBreak/>
         <w:t>___</w:t>
       </w:r>
     </w:p>
@@ -4688,577 +4709,577 @@
           <w:sz w:val="32"/>
           <w:szCs w:val="32"/>
         </w:rPr>
+        <w:t>&lt;/details&gt;</w:t>
+      </w:r>
+    </w:p>
+    <w:p>
+      <w:pPr>
+        <w:jc w:val="both"/>
+        <w:rPr>
+          <w:color w:val="000000" w:themeColor="text1"/>
+          <w:sz w:val="32"/>
+          <w:szCs w:val="32"/>
+        </w:rPr>
+      </w:pPr>
+    </w:p>
+    <w:p>
+      <w:pPr>
+        <w:jc w:val="both"/>
+        <w:rPr>
+          <w:color w:val="000000" w:themeColor="text1"/>
+          <w:sz w:val="32"/>
+          <w:szCs w:val="32"/>
+        </w:rPr>
+      </w:pPr>
+      <w:r>
+        <w:rPr>
+          <w:color w:val="000000" w:themeColor="text1"/>
+          <w:sz w:val="32"/>
+          <w:szCs w:val="32"/>
+        </w:rPr>
+        <w:t>Centering Content in README:</w:t>
+      </w:r>
+    </w:p>
+    <w:p>
+      <w:pPr>
+        <w:jc w:val="both"/>
+        <w:rPr>
+          <w:color w:val="000000" w:themeColor="text1"/>
+          <w:sz w:val="32"/>
+          <w:szCs w:val="32"/>
+        </w:rPr>
+      </w:pPr>
+      <w:r>
+        <w:rPr>
+          <w:color w:val="000000" w:themeColor="text1"/>
+          <w:sz w:val="32"/>
+          <w:szCs w:val="32"/>
+        </w:rPr>
+        <w:t># Using HTML’s div tag</w:t>
+      </w:r>
+    </w:p>
+    <w:p>
+      <w:pPr>
+        <w:jc w:val="both"/>
+        <w:rPr>
+          <w:b/>
+          <w:bCs/>
+          <w:color w:val="D86DCB" w:themeColor="accent5" w:themeTint="99"/>
+          <w:sz w:val="32"/>
+          <w:szCs w:val="32"/>
+        </w:rPr>
+      </w:pPr>
+      <w:r>
+        <w:rPr>
+          <w:b/>
+          <w:bCs/>
+          <w:color w:val="D86DCB" w:themeColor="accent5" w:themeTint="99"/>
+          <w:sz w:val="32"/>
+          <w:szCs w:val="32"/>
+        </w:rPr>
+        <w:t>&lt;div align="center"&gt;</w:t>
+      </w:r>
+    </w:p>
+    <w:p>
+      <w:pPr>
+        <w:jc w:val="both"/>
+        <w:rPr>
+          <w:b/>
+          <w:bCs/>
+          <w:color w:val="D86DCB" w:themeColor="accent5" w:themeTint="99"/>
+          <w:sz w:val="32"/>
+          <w:szCs w:val="32"/>
+        </w:rPr>
+      </w:pPr>
+    </w:p>
+    <w:p>
+      <w:pPr>
+        <w:jc w:val="both"/>
+        <w:rPr>
+          <w:b/>
+          <w:bCs/>
+          <w:color w:val="D86DCB" w:themeColor="accent5" w:themeTint="99"/>
+          <w:sz w:val="32"/>
+          <w:szCs w:val="32"/>
+        </w:rPr>
+      </w:pPr>
+      <w:r>
+        <w:rPr>
+          <w:b/>
+          <w:bCs/>
+          <w:color w:val="D86DCB" w:themeColor="accent5" w:themeTint="99"/>
+          <w:sz w:val="32"/>
+          <w:szCs w:val="32"/>
+        </w:rPr>
+        <w:t># Project Title</w:t>
+      </w:r>
+    </w:p>
+    <w:p>
+      <w:pPr>
+        <w:jc w:val="both"/>
+        <w:rPr>
+          <w:b/>
+          <w:bCs/>
+          <w:color w:val="D86DCB" w:themeColor="accent5" w:themeTint="99"/>
+          <w:sz w:val="32"/>
+          <w:szCs w:val="32"/>
+        </w:rPr>
+      </w:pPr>
+    </w:p>
+    <w:p>
+      <w:pPr>
+        <w:jc w:val="both"/>
+        <w:rPr>
+          <w:b/>
+          <w:bCs/>
+          <w:color w:val="D86DCB" w:themeColor="accent5" w:themeTint="99"/>
+          <w:sz w:val="32"/>
+          <w:szCs w:val="32"/>
+        </w:rPr>
+      </w:pPr>
+      <w:r>
+        <w:rPr>
+          <w:b/>
+          <w:bCs/>
+          <w:color w:val="D86DCB" w:themeColor="accent5" w:themeTint="99"/>
+          <w:sz w:val="32"/>
+          <w:szCs w:val="32"/>
+        </w:rPr>
+        <w:t>&lt;/div&gt;</w:t>
+      </w:r>
+    </w:p>
+    <w:p>
+      <w:pPr>
+        <w:jc w:val="both"/>
+        <w:rPr>
+          <w:color w:val="000000" w:themeColor="text1"/>
+          <w:sz w:val="32"/>
+          <w:szCs w:val="32"/>
+        </w:rPr>
+      </w:pPr>
+    </w:p>
+    <w:p>
+      <w:pPr>
+        <w:jc w:val="both"/>
+        <w:rPr>
+          <w:color w:val="000000" w:themeColor="text1"/>
+          <w:sz w:val="32"/>
+          <w:szCs w:val="32"/>
+        </w:rPr>
+      </w:pPr>
+      <w:r>
+        <w:rPr>
+          <w:color w:val="000000" w:themeColor="text1"/>
+          <w:sz w:val="32"/>
+          <w:szCs w:val="32"/>
+        </w:rPr>
+        <w:t>Keyboard Keys in README:</w:t>
+      </w:r>
+    </w:p>
+    <w:p>
+      <w:pPr>
+        <w:jc w:val="both"/>
+        <w:rPr>
+          <w:color w:val="000000" w:themeColor="text1"/>
+          <w:sz w:val="32"/>
+          <w:szCs w:val="32"/>
+        </w:rPr>
+      </w:pPr>
+      <w:r>
+        <w:rPr>
+          <w:color w:val="000000" w:themeColor="text1"/>
+          <w:sz w:val="32"/>
+          <w:szCs w:val="32"/>
+        </w:rPr>
+        <w:t># Follow this pattern (It’ll show</w:t>
+      </w:r>
+      <w:r>
+        <w:rPr>
+          <w:b/>
+          <w:bCs/>
+          <w:color w:val="000000" w:themeColor="text1"/>
+          <w:sz w:val="32"/>
+          <w:szCs w:val="32"/>
+        </w:rPr>
+        <w:t xml:space="preserve"> Press ctr + c</w:t>
+      </w:r>
+      <w:r>
+        <w:rPr>
+          <w:color w:val="000000" w:themeColor="text1"/>
+          <w:sz w:val="32"/>
+          <w:szCs w:val="32"/>
+        </w:rPr>
+        <w:t>):</w:t>
+      </w:r>
+    </w:p>
+    <w:p>
+      <w:pPr>
+        <w:jc w:val="both"/>
+        <w:rPr>
+          <w:b/>
+          <w:bCs/>
+          <w:color w:val="D86DCB" w:themeColor="accent5" w:themeTint="99"/>
+          <w:sz w:val="32"/>
+          <w:szCs w:val="32"/>
+        </w:rPr>
+      </w:pPr>
+      <w:r>
+        <w:rPr>
+          <w:b/>
+          <w:bCs/>
+          <w:color w:val="D86DCB" w:themeColor="accent5" w:themeTint="99"/>
+          <w:sz w:val="32"/>
+          <w:szCs w:val="32"/>
+        </w:rPr>
+        <w:t>Press &lt;</w:t>
+      </w:r>
+      <w:proofErr w:type="spellStart"/>
+      <w:r>
+        <w:rPr>
+          <w:b/>
+          <w:bCs/>
+          <w:color w:val="D86DCB" w:themeColor="accent5" w:themeTint="99"/>
+          <w:sz w:val="32"/>
+          <w:szCs w:val="32"/>
+        </w:rPr>
+        <w:t>kbd</w:t>
+      </w:r>
+      <w:proofErr w:type="spellEnd"/>
+      <w:r>
+        <w:rPr>
+          <w:b/>
+          <w:bCs/>
+          <w:color w:val="D86DCB" w:themeColor="accent5" w:themeTint="99"/>
+          <w:sz w:val="32"/>
+          <w:szCs w:val="32"/>
+        </w:rPr>
+        <w:t>&gt;Ctrl&lt;/</w:t>
+      </w:r>
+      <w:proofErr w:type="spellStart"/>
+      <w:r>
+        <w:rPr>
+          <w:b/>
+          <w:bCs/>
+          <w:color w:val="D86DCB" w:themeColor="accent5" w:themeTint="99"/>
+          <w:sz w:val="32"/>
+          <w:szCs w:val="32"/>
+        </w:rPr>
+        <w:t>kbd</w:t>
+      </w:r>
+      <w:proofErr w:type="spellEnd"/>
+      <w:r>
+        <w:rPr>
+          <w:b/>
+          <w:bCs/>
+          <w:color w:val="D86DCB" w:themeColor="accent5" w:themeTint="99"/>
+          <w:sz w:val="32"/>
+          <w:szCs w:val="32"/>
+        </w:rPr>
+        <w:t>&gt; + &lt;</w:t>
+      </w:r>
+      <w:proofErr w:type="spellStart"/>
+      <w:r>
+        <w:rPr>
+          <w:b/>
+          <w:bCs/>
+          <w:color w:val="D86DCB" w:themeColor="accent5" w:themeTint="99"/>
+          <w:sz w:val="32"/>
+          <w:szCs w:val="32"/>
+        </w:rPr>
+        <w:t>kbd</w:t>
+      </w:r>
+      <w:proofErr w:type="spellEnd"/>
+      <w:r>
+        <w:rPr>
+          <w:b/>
+          <w:bCs/>
+          <w:color w:val="D86DCB" w:themeColor="accent5" w:themeTint="99"/>
+          <w:sz w:val="32"/>
+          <w:szCs w:val="32"/>
+        </w:rPr>
+        <w:t>&gt;C&lt;/</w:t>
+      </w:r>
+      <w:proofErr w:type="spellStart"/>
+      <w:r>
+        <w:rPr>
+          <w:b/>
+          <w:bCs/>
+          <w:color w:val="D86DCB" w:themeColor="accent5" w:themeTint="99"/>
+          <w:sz w:val="32"/>
+          <w:szCs w:val="32"/>
+        </w:rPr>
+        <w:t>kbd</w:t>
+      </w:r>
+      <w:proofErr w:type="spellEnd"/>
+      <w:r>
+        <w:rPr>
+          <w:b/>
+          <w:bCs/>
+          <w:color w:val="D86DCB" w:themeColor="accent5" w:themeTint="99"/>
+          <w:sz w:val="32"/>
+          <w:szCs w:val="32"/>
+        </w:rPr>
+        <w:t>&gt;</w:t>
+      </w:r>
+    </w:p>
+    <w:p>
+      <w:pPr>
+        <w:jc w:val="both"/>
+        <w:rPr>
+          <w:color w:val="000000" w:themeColor="text1"/>
+          <w:sz w:val="32"/>
+          <w:szCs w:val="32"/>
+        </w:rPr>
+      </w:pPr>
+    </w:p>
+    <w:p>
+      <w:pPr>
+        <w:jc w:val="both"/>
+        <w:rPr>
+          <w:color w:val="000000" w:themeColor="text1"/>
+          <w:sz w:val="32"/>
+          <w:szCs w:val="32"/>
+        </w:rPr>
+      </w:pPr>
+      <w:r>
+        <w:rPr>
+          <w:color w:val="000000" w:themeColor="text1"/>
+          <w:sz w:val="32"/>
+          <w:szCs w:val="32"/>
+        </w:rPr>
+        <w:t>Highlighted Notes in README:</w:t>
+      </w:r>
+    </w:p>
+    <w:p>
+      <w:pPr>
+        <w:jc w:val="both"/>
+        <w:rPr>
+          <w:color w:val="000000" w:themeColor="text1"/>
+          <w:sz w:val="32"/>
+          <w:szCs w:val="32"/>
+        </w:rPr>
+      </w:pPr>
+      <w:r>
+        <w:rPr>
+          <w:color w:val="000000" w:themeColor="text1"/>
+          <w:sz w:val="32"/>
+          <w:szCs w:val="32"/>
+        </w:rPr>
+        <w:t xml:space="preserve"># </w:t>
+      </w:r>
+      <w:r>
+        <w:rPr>
+          <w:color w:val="000000" w:themeColor="text1"/>
+          <w:sz w:val="32"/>
+          <w:szCs w:val="32"/>
+        </w:rPr>
+        <w:t xml:space="preserve">Use right arrow </w:t>
+      </w:r>
+      <w:r>
+        <w:rPr>
+          <w:b/>
+          <w:bCs/>
+          <w:color w:val="000000" w:themeColor="text1"/>
+          <w:sz w:val="32"/>
+          <w:szCs w:val="32"/>
+        </w:rPr>
+        <w:t xml:space="preserve">&gt; </w:t>
+      </w:r>
+      <w:r>
+        <w:rPr>
+          <w:color w:val="000000" w:themeColor="text1"/>
+          <w:sz w:val="32"/>
+          <w:szCs w:val="32"/>
+        </w:rPr>
+        <w:t xml:space="preserve">and double star *…* </w:t>
+      </w:r>
+    </w:p>
+    <w:p>
+      <w:pPr>
+        <w:jc w:val="both"/>
+        <w:rPr>
+          <w:b/>
+          <w:bCs/>
+          <w:color w:val="D86DCB" w:themeColor="accent5" w:themeTint="99"/>
+          <w:sz w:val="32"/>
+          <w:szCs w:val="32"/>
+        </w:rPr>
+      </w:pPr>
+      <w:r>
+        <w:rPr>
+          <w:b/>
+          <w:bCs/>
+          <w:color w:val="D86DCB" w:themeColor="accent5" w:themeTint="99"/>
+          <w:sz w:val="32"/>
+          <w:szCs w:val="32"/>
+        </w:rPr>
+        <w:t xml:space="preserve">&gt; </w:t>
+      </w:r>
+      <w:r>
+        <w:rPr>
+          <w:rFonts w:ascii="Segoe UI Symbol" w:hAnsi="Segoe UI Symbol" w:cs="Segoe UI Symbol"/>
+          <w:b/>
+          <w:bCs/>
+          <w:color w:val="D86DCB" w:themeColor="accent5" w:themeTint="99"/>
+          <w:sz w:val="32"/>
+          <w:szCs w:val="32"/>
+        </w:rPr>
+        <w:t>⚠</w:t>
+      </w:r>
+      <w:r>
+        <w:rPr>
+          <w:b/>
+          <w:bCs/>
+          <w:color w:val="D86DCB" w:themeColor="accent5" w:themeTint="99"/>
+          <w:sz w:val="32"/>
+          <w:szCs w:val="32"/>
+        </w:rPr>
+        <w:t>️ **</w:t>
+      </w:r>
+      <w:proofErr w:type="gramStart"/>
+      <w:r>
+        <w:rPr>
+          <w:b/>
+          <w:bCs/>
+          <w:color w:val="D86DCB" w:themeColor="accent5" w:themeTint="99"/>
+          <w:sz w:val="32"/>
+          <w:szCs w:val="32"/>
+        </w:rPr>
+        <w:t>Warning:*</w:t>
+      </w:r>
+      <w:proofErr w:type="gramEnd"/>
+      <w:r>
+        <w:rPr>
+          <w:b/>
+          <w:bCs/>
+          <w:color w:val="D86DCB" w:themeColor="accent5" w:themeTint="99"/>
+          <w:sz w:val="32"/>
+          <w:szCs w:val="32"/>
+        </w:rPr>
+        <w:t>* Be careful</w:t>
+      </w:r>
+    </w:p>
+    <w:p>
+      <w:pPr>
+        <w:jc w:val="both"/>
+        <w:rPr>
+          <w:b/>
+          <w:bCs/>
+          <w:color w:val="D86DCB" w:themeColor="accent5" w:themeTint="99"/>
+          <w:sz w:val="32"/>
+          <w:szCs w:val="32"/>
+        </w:rPr>
+      </w:pPr>
+    </w:p>
+    <w:p>
+      <w:pPr>
+        <w:jc w:val="both"/>
+        <w:rPr>
+          <w:b/>
+          <w:bCs/>
+          <w:color w:val="D86DCB" w:themeColor="accent5" w:themeTint="99"/>
+          <w:sz w:val="32"/>
+          <w:szCs w:val="32"/>
+        </w:rPr>
+      </w:pPr>
+      <w:r>
+        <w:rPr>
+          <w:b/>
+          <w:bCs/>
+          <w:color w:val="D86DCB" w:themeColor="accent5" w:themeTint="99"/>
+          <w:sz w:val="32"/>
+          <w:szCs w:val="32"/>
+        </w:rPr>
+        <w:t xml:space="preserve">&gt; </w:t>
+      </w:r>
+      <w:r>
+        <w:rPr>
+          <w:rFonts w:ascii="Segoe UI Emoji" w:hAnsi="Segoe UI Emoji" w:cs="Segoe UI Emoji"/>
+          <w:b/>
+          <w:bCs/>
+          <w:color w:val="D86DCB" w:themeColor="accent5" w:themeTint="99"/>
+          <w:sz w:val="32"/>
+          <w:szCs w:val="32"/>
+        </w:rPr>
+        <w:t>💡</w:t>
+      </w:r>
+      <w:r>
+        <w:rPr>
+          <w:b/>
+          <w:bCs/>
+          <w:color w:val="D86DCB" w:themeColor="accent5" w:themeTint="99"/>
+          <w:sz w:val="32"/>
+          <w:szCs w:val="32"/>
+        </w:rPr>
+        <w:t xml:space="preserve"> **</w:t>
+      </w:r>
+      <w:proofErr w:type="gramStart"/>
+      <w:r>
+        <w:rPr>
+          <w:b/>
+          <w:bCs/>
+          <w:color w:val="D86DCB" w:themeColor="accent5" w:themeTint="99"/>
+          <w:sz w:val="32"/>
+          <w:szCs w:val="32"/>
+        </w:rPr>
+        <w:t>Tip:*</w:t>
+      </w:r>
+      <w:proofErr w:type="gramEnd"/>
+      <w:r>
+        <w:rPr>
+          <w:b/>
+          <w:bCs/>
+          <w:color w:val="D86DCB" w:themeColor="accent5" w:themeTint="99"/>
+          <w:sz w:val="32"/>
+          <w:szCs w:val="32"/>
+        </w:rPr>
+        <w:t>* Useful info</w:t>
+      </w:r>
+    </w:p>
+    <w:p>
+      <w:pPr>
+        <w:jc w:val="both"/>
+        <w:rPr>
+          <w:color w:val="000000" w:themeColor="text1"/>
+          <w:sz w:val="32"/>
+          <w:szCs w:val="32"/>
+        </w:rPr>
+      </w:pPr>
+    </w:p>
+    <w:p>
+      <w:pPr>
+        <w:jc w:val="both"/>
+        <w:rPr>
+          <w:color w:val="000000" w:themeColor="text1"/>
+          <w:sz w:val="32"/>
+          <w:szCs w:val="32"/>
+        </w:rPr>
+      </w:pPr>
+      <w:r>
+        <w:rPr>
+          <w:color w:val="000000" w:themeColor="text1"/>
+          <w:sz w:val="32"/>
+          <w:szCs w:val="32"/>
+        </w:rPr>
+        <w:t>Anchor Links in README:</w:t>
+      </w:r>
+    </w:p>
+    <w:p>
+      <w:pPr>
+        <w:jc w:val="both"/>
+        <w:rPr>
+          <w:color w:val="000000" w:themeColor="text1"/>
+          <w:sz w:val="32"/>
+          <w:szCs w:val="32"/>
+        </w:rPr>
+      </w:pPr>
+      <w:r>
+        <w:rPr>
+          <w:color w:val="000000" w:themeColor="text1"/>
+          <w:sz w:val="32"/>
+          <w:szCs w:val="32"/>
+        </w:rPr>
         <w:lastRenderedPageBreak/>
-        <w:t>&lt;/details&gt;</w:t>
-      </w:r>
-    </w:p>
-    <w:p>
-      <w:pPr>
-        <w:jc w:val="both"/>
-        <w:rPr>
-          <w:color w:val="000000" w:themeColor="text1"/>
-          <w:sz w:val="32"/>
-          <w:szCs w:val="32"/>
-        </w:rPr>
-      </w:pPr>
-    </w:p>
-    <w:p>
-      <w:pPr>
-        <w:jc w:val="both"/>
-        <w:rPr>
-          <w:color w:val="000000" w:themeColor="text1"/>
-          <w:sz w:val="32"/>
-          <w:szCs w:val="32"/>
-        </w:rPr>
-      </w:pPr>
-      <w:r>
-        <w:rPr>
-          <w:color w:val="000000" w:themeColor="text1"/>
-          <w:sz w:val="32"/>
-          <w:szCs w:val="32"/>
-        </w:rPr>
-        <w:t>Centering Content in README:</w:t>
-      </w:r>
-    </w:p>
-    <w:p>
-      <w:pPr>
-        <w:jc w:val="both"/>
-        <w:rPr>
-          <w:color w:val="000000" w:themeColor="text1"/>
-          <w:sz w:val="32"/>
-          <w:szCs w:val="32"/>
-        </w:rPr>
-      </w:pPr>
-      <w:r>
-        <w:rPr>
-          <w:color w:val="000000" w:themeColor="text1"/>
-          <w:sz w:val="32"/>
-          <w:szCs w:val="32"/>
-        </w:rPr>
-        <w:t># Using HTML’s div tag</w:t>
-      </w:r>
-    </w:p>
-    <w:p>
-      <w:pPr>
-        <w:jc w:val="both"/>
-        <w:rPr>
-          <w:b/>
-          <w:bCs/>
-          <w:color w:val="D86DCB" w:themeColor="accent5" w:themeTint="99"/>
-          <w:sz w:val="32"/>
-          <w:szCs w:val="32"/>
-        </w:rPr>
-      </w:pPr>
-      <w:r>
-        <w:rPr>
-          <w:b/>
-          <w:bCs/>
-          <w:color w:val="D86DCB" w:themeColor="accent5" w:themeTint="99"/>
-          <w:sz w:val="32"/>
-          <w:szCs w:val="32"/>
-        </w:rPr>
-        <w:t>&lt;div align="center"&gt;</w:t>
-      </w:r>
-    </w:p>
-    <w:p>
-      <w:pPr>
-        <w:jc w:val="both"/>
-        <w:rPr>
-          <w:b/>
-          <w:bCs/>
-          <w:color w:val="D86DCB" w:themeColor="accent5" w:themeTint="99"/>
-          <w:sz w:val="32"/>
-          <w:szCs w:val="32"/>
-        </w:rPr>
-      </w:pPr>
-    </w:p>
-    <w:p>
-      <w:pPr>
-        <w:jc w:val="both"/>
-        <w:rPr>
-          <w:b/>
-          <w:bCs/>
-          <w:color w:val="D86DCB" w:themeColor="accent5" w:themeTint="99"/>
-          <w:sz w:val="32"/>
-          <w:szCs w:val="32"/>
-        </w:rPr>
-      </w:pPr>
-      <w:r>
-        <w:rPr>
-          <w:b/>
-          <w:bCs/>
-          <w:color w:val="D86DCB" w:themeColor="accent5" w:themeTint="99"/>
-          <w:sz w:val="32"/>
-          <w:szCs w:val="32"/>
-        </w:rPr>
-        <w:t># Project Title</w:t>
-      </w:r>
-    </w:p>
-    <w:p>
-      <w:pPr>
-        <w:jc w:val="both"/>
-        <w:rPr>
-          <w:b/>
-          <w:bCs/>
-          <w:color w:val="D86DCB" w:themeColor="accent5" w:themeTint="99"/>
-          <w:sz w:val="32"/>
-          <w:szCs w:val="32"/>
-        </w:rPr>
-      </w:pPr>
-    </w:p>
-    <w:p>
-      <w:pPr>
-        <w:jc w:val="both"/>
-        <w:rPr>
-          <w:b/>
-          <w:bCs/>
-          <w:color w:val="D86DCB" w:themeColor="accent5" w:themeTint="99"/>
-          <w:sz w:val="32"/>
-          <w:szCs w:val="32"/>
-        </w:rPr>
-      </w:pPr>
-      <w:r>
-        <w:rPr>
-          <w:b/>
-          <w:bCs/>
-          <w:color w:val="D86DCB" w:themeColor="accent5" w:themeTint="99"/>
-          <w:sz w:val="32"/>
-          <w:szCs w:val="32"/>
-        </w:rPr>
-        <w:t>&lt;/div&gt;</w:t>
-      </w:r>
-    </w:p>
-    <w:p>
-      <w:pPr>
-        <w:jc w:val="both"/>
-        <w:rPr>
-          <w:color w:val="000000" w:themeColor="text1"/>
-          <w:sz w:val="32"/>
-          <w:szCs w:val="32"/>
-        </w:rPr>
-      </w:pPr>
-    </w:p>
-    <w:p>
-      <w:pPr>
-        <w:jc w:val="both"/>
-        <w:rPr>
-          <w:color w:val="000000" w:themeColor="text1"/>
-          <w:sz w:val="32"/>
-          <w:szCs w:val="32"/>
-        </w:rPr>
-      </w:pPr>
-      <w:r>
-        <w:rPr>
-          <w:color w:val="000000" w:themeColor="text1"/>
-          <w:sz w:val="32"/>
-          <w:szCs w:val="32"/>
-        </w:rPr>
-        <w:t>Keyboard Keys in README:</w:t>
-      </w:r>
-    </w:p>
-    <w:p>
-      <w:pPr>
-        <w:jc w:val="both"/>
-        <w:rPr>
-          <w:color w:val="000000" w:themeColor="text1"/>
-          <w:sz w:val="32"/>
-          <w:szCs w:val="32"/>
-        </w:rPr>
-      </w:pPr>
-      <w:r>
-        <w:rPr>
-          <w:color w:val="000000" w:themeColor="text1"/>
-          <w:sz w:val="32"/>
-          <w:szCs w:val="32"/>
-        </w:rPr>
-        <w:t># Follow this pattern (It’ll show</w:t>
-      </w:r>
-      <w:r>
-        <w:rPr>
-          <w:b/>
-          <w:bCs/>
-          <w:color w:val="000000" w:themeColor="text1"/>
-          <w:sz w:val="32"/>
-          <w:szCs w:val="32"/>
-        </w:rPr>
-        <w:t xml:space="preserve"> Press ctr + c</w:t>
-      </w:r>
-      <w:r>
-        <w:rPr>
-          <w:color w:val="000000" w:themeColor="text1"/>
-          <w:sz w:val="32"/>
-          <w:szCs w:val="32"/>
-        </w:rPr>
-        <w:t>):</w:t>
-      </w:r>
-    </w:p>
-    <w:p>
-      <w:pPr>
-        <w:jc w:val="both"/>
-        <w:rPr>
-          <w:b/>
-          <w:bCs/>
-          <w:color w:val="D86DCB" w:themeColor="accent5" w:themeTint="99"/>
-          <w:sz w:val="32"/>
-          <w:szCs w:val="32"/>
-        </w:rPr>
-      </w:pPr>
-      <w:r>
-        <w:rPr>
-          <w:b/>
-          <w:bCs/>
-          <w:color w:val="D86DCB" w:themeColor="accent5" w:themeTint="99"/>
-          <w:sz w:val="32"/>
-          <w:szCs w:val="32"/>
-        </w:rPr>
-        <w:t>Press &lt;</w:t>
-      </w:r>
-      <w:proofErr w:type="spellStart"/>
-      <w:r>
-        <w:rPr>
-          <w:b/>
-          <w:bCs/>
-          <w:color w:val="D86DCB" w:themeColor="accent5" w:themeTint="99"/>
-          <w:sz w:val="32"/>
-          <w:szCs w:val="32"/>
-        </w:rPr>
-        <w:t>kbd</w:t>
-      </w:r>
-      <w:proofErr w:type="spellEnd"/>
-      <w:r>
-        <w:rPr>
-          <w:b/>
-          <w:bCs/>
-          <w:color w:val="D86DCB" w:themeColor="accent5" w:themeTint="99"/>
-          <w:sz w:val="32"/>
-          <w:szCs w:val="32"/>
-        </w:rPr>
-        <w:t>&gt;Ctrl&lt;/</w:t>
-      </w:r>
-      <w:proofErr w:type="spellStart"/>
-      <w:r>
-        <w:rPr>
-          <w:b/>
-          <w:bCs/>
-          <w:color w:val="D86DCB" w:themeColor="accent5" w:themeTint="99"/>
-          <w:sz w:val="32"/>
-          <w:szCs w:val="32"/>
-        </w:rPr>
-        <w:t>kbd</w:t>
-      </w:r>
-      <w:proofErr w:type="spellEnd"/>
-      <w:r>
-        <w:rPr>
-          <w:b/>
-          <w:bCs/>
-          <w:color w:val="D86DCB" w:themeColor="accent5" w:themeTint="99"/>
-          <w:sz w:val="32"/>
-          <w:szCs w:val="32"/>
-        </w:rPr>
-        <w:t>&gt; + &lt;</w:t>
-      </w:r>
-      <w:proofErr w:type="spellStart"/>
-      <w:r>
-        <w:rPr>
-          <w:b/>
-          <w:bCs/>
-          <w:color w:val="D86DCB" w:themeColor="accent5" w:themeTint="99"/>
-          <w:sz w:val="32"/>
-          <w:szCs w:val="32"/>
-        </w:rPr>
-        <w:t>kbd</w:t>
-      </w:r>
-      <w:proofErr w:type="spellEnd"/>
-      <w:r>
-        <w:rPr>
-          <w:b/>
-          <w:bCs/>
-          <w:color w:val="D86DCB" w:themeColor="accent5" w:themeTint="99"/>
-          <w:sz w:val="32"/>
-          <w:szCs w:val="32"/>
-        </w:rPr>
-        <w:t>&gt;C&lt;/</w:t>
-      </w:r>
-      <w:proofErr w:type="spellStart"/>
-      <w:r>
-        <w:rPr>
-          <w:b/>
-          <w:bCs/>
-          <w:color w:val="D86DCB" w:themeColor="accent5" w:themeTint="99"/>
-          <w:sz w:val="32"/>
-          <w:szCs w:val="32"/>
-        </w:rPr>
-        <w:t>kbd</w:t>
-      </w:r>
-      <w:proofErr w:type="spellEnd"/>
-      <w:r>
-        <w:rPr>
-          <w:b/>
-          <w:bCs/>
-          <w:color w:val="D86DCB" w:themeColor="accent5" w:themeTint="99"/>
-          <w:sz w:val="32"/>
-          <w:szCs w:val="32"/>
-        </w:rPr>
-        <w:t>&gt;</w:t>
-      </w:r>
-    </w:p>
-    <w:p>
-      <w:pPr>
-        <w:jc w:val="both"/>
-        <w:rPr>
-          <w:color w:val="000000" w:themeColor="text1"/>
-          <w:sz w:val="32"/>
-          <w:szCs w:val="32"/>
-        </w:rPr>
-      </w:pPr>
-    </w:p>
-    <w:p>
-      <w:pPr>
-        <w:jc w:val="both"/>
-        <w:rPr>
-          <w:color w:val="000000" w:themeColor="text1"/>
-          <w:sz w:val="32"/>
-          <w:szCs w:val="32"/>
-        </w:rPr>
-      </w:pPr>
-      <w:r>
-        <w:rPr>
-          <w:color w:val="000000" w:themeColor="text1"/>
-          <w:sz w:val="32"/>
-          <w:szCs w:val="32"/>
-        </w:rPr>
-        <w:t>Highlighted Notes in README:</w:t>
-      </w:r>
-    </w:p>
-    <w:p>
-      <w:pPr>
-        <w:jc w:val="both"/>
-        <w:rPr>
-          <w:color w:val="000000" w:themeColor="text1"/>
-          <w:sz w:val="32"/>
-          <w:szCs w:val="32"/>
-        </w:rPr>
-      </w:pPr>
-      <w:r>
-        <w:rPr>
-          <w:color w:val="000000" w:themeColor="text1"/>
-          <w:sz w:val="32"/>
-          <w:szCs w:val="32"/>
-        </w:rPr>
-        <w:t xml:space="preserve"># </w:t>
-      </w:r>
-      <w:r>
-        <w:rPr>
-          <w:color w:val="000000" w:themeColor="text1"/>
-          <w:sz w:val="32"/>
-          <w:szCs w:val="32"/>
-        </w:rPr>
-        <w:t xml:space="preserve">Use right arrow </w:t>
-      </w:r>
-      <w:r>
-        <w:rPr>
-          <w:b/>
-          <w:bCs/>
-          <w:color w:val="000000" w:themeColor="text1"/>
-          <w:sz w:val="32"/>
-          <w:szCs w:val="32"/>
-        </w:rPr>
-        <w:t xml:space="preserve">&gt; </w:t>
-      </w:r>
-      <w:r>
-        <w:rPr>
-          <w:color w:val="000000" w:themeColor="text1"/>
-          <w:sz w:val="32"/>
-          <w:szCs w:val="32"/>
-        </w:rPr>
-        <w:t xml:space="preserve">and double star *…* </w:t>
-      </w:r>
-    </w:p>
-    <w:p>
-      <w:pPr>
-        <w:jc w:val="both"/>
-        <w:rPr>
-          <w:b/>
-          <w:bCs/>
-          <w:color w:val="D86DCB" w:themeColor="accent5" w:themeTint="99"/>
-          <w:sz w:val="32"/>
-          <w:szCs w:val="32"/>
-        </w:rPr>
-      </w:pPr>
-      <w:r>
-        <w:rPr>
-          <w:b/>
-          <w:bCs/>
-          <w:color w:val="D86DCB" w:themeColor="accent5" w:themeTint="99"/>
-          <w:sz w:val="32"/>
-          <w:szCs w:val="32"/>
-        </w:rPr>
-        <w:t xml:space="preserve">&gt; </w:t>
-      </w:r>
-      <w:r>
-        <w:rPr>
-          <w:rFonts w:ascii="Segoe UI Symbol" w:hAnsi="Segoe UI Symbol" w:cs="Segoe UI Symbol"/>
-          <w:b/>
-          <w:bCs/>
-          <w:color w:val="D86DCB" w:themeColor="accent5" w:themeTint="99"/>
-          <w:sz w:val="32"/>
-          <w:szCs w:val="32"/>
-        </w:rPr>
-        <w:t>⚠</w:t>
-      </w:r>
-      <w:r>
-        <w:rPr>
-          <w:b/>
-          <w:bCs/>
-          <w:color w:val="D86DCB" w:themeColor="accent5" w:themeTint="99"/>
-          <w:sz w:val="32"/>
-          <w:szCs w:val="32"/>
-        </w:rPr>
-        <w:t>️ **</w:t>
-      </w:r>
-      <w:proofErr w:type="gramStart"/>
-      <w:r>
-        <w:rPr>
-          <w:b/>
-          <w:bCs/>
-          <w:color w:val="D86DCB" w:themeColor="accent5" w:themeTint="99"/>
-          <w:sz w:val="32"/>
-          <w:szCs w:val="32"/>
-        </w:rPr>
-        <w:t>Warning:*</w:t>
-      </w:r>
-      <w:proofErr w:type="gramEnd"/>
-      <w:r>
-        <w:rPr>
-          <w:b/>
-          <w:bCs/>
-          <w:color w:val="D86DCB" w:themeColor="accent5" w:themeTint="99"/>
-          <w:sz w:val="32"/>
-          <w:szCs w:val="32"/>
-        </w:rPr>
-        <w:t>* Be careful</w:t>
-      </w:r>
-    </w:p>
-    <w:p>
-      <w:pPr>
-        <w:jc w:val="both"/>
-        <w:rPr>
-          <w:b/>
-          <w:bCs/>
-          <w:color w:val="D86DCB" w:themeColor="accent5" w:themeTint="99"/>
-          <w:sz w:val="32"/>
-          <w:szCs w:val="32"/>
-        </w:rPr>
-      </w:pPr>
-    </w:p>
-    <w:p>
-      <w:pPr>
-        <w:jc w:val="both"/>
-        <w:rPr>
-          <w:b/>
-          <w:bCs/>
-          <w:color w:val="D86DCB" w:themeColor="accent5" w:themeTint="99"/>
-          <w:sz w:val="32"/>
-          <w:szCs w:val="32"/>
-        </w:rPr>
-      </w:pPr>
-      <w:r>
-        <w:rPr>
-          <w:b/>
-          <w:bCs/>
-          <w:color w:val="D86DCB" w:themeColor="accent5" w:themeTint="99"/>
-          <w:sz w:val="32"/>
-          <w:szCs w:val="32"/>
-        </w:rPr>
-        <w:t xml:space="preserve">&gt; </w:t>
-      </w:r>
-      <w:r>
-        <w:rPr>
-          <w:rFonts w:ascii="Segoe UI Emoji" w:hAnsi="Segoe UI Emoji" w:cs="Segoe UI Emoji"/>
-          <w:b/>
-          <w:bCs/>
-          <w:color w:val="D86DCB" w:themeColor="accent5" w:themeTint="99"/>
-          <w:sz w:val="32"/>
-          <w:szCs w:val="32"/>
-        </w:rPr>
-        <w:t>💡</w:t>
-      </w:r>
-      <w:r>
-        <w:rPr>
-          <w:b/>
-          <w:bCs/>
-          <w:color w:val="D86DCB" w:themeColor="accent5" w:themeTint="99"/>
-          <w:sz w:val="32"/>
-          <w:szCs w:val="32"/>
-        </w:rPr>
-        <w:t xml:space="preserve"> **</w:t>
-      </w:r>
-      <w:proofErr w:type="gramStart"/>
-      <w:r>
-        <w:rPr>
-          <w:b/>
-          <w:bCs/>
-          <w:color w:val="D86DCB" w:themeColor="accent5" w:themeTint="99"/>
-          <w:sz w:val="32"/>
-          <w:szCs w:val="32"/>
-        </w:rPr>
-        <w:t>Tip:*</w:t>
-      </w:r>
-      <w:proofErr w:type="gramEnd"/>
-      <w:r>
-        <w:rPr>
-          <w:b/>
-          <w:bCs/>
-          <w:color w:val="D86DCB" w:themeColor="accent5" w:themeTint="99"/>
-          <w:sz w:val="32"/>
-          <w:szCs w:val="32"/>
-        </w:rPr>
-        <w:t>* Useful info</w:t>
-      </w:r>
-    </w:p>
-    <w:p>
-      <w:pPr>
-        <w:jc w:val="both"/>
-        <w:rPr>
-          <w:color w:val="000000" w:themeColor="text1"/>
-          <w:sz w:val="32"/>
-          <w:szCs w:val="32"/>
-        </w:rPr>
-      </w:pPr>
-    </w:p>
-    <w:p>
-      <w:pPr>
-        <w:jc w:val="both"/>
-        <w:rPr>
-          <w:color w:val="000000" w:themeColor="text1"/>
-          <w:sz w:val="32"/>
-          <w:szCs w:val="32"/>
-        </w:rPr>
-      </w:pPr>
-      <w:r>
-        <w:rPr>
-          <w:color w:val="000000" w:themeColor="text1"/>
-          <w:sz w:val="32"/>
-          <w:szCs w:val="32"/>
-        </w:rPr>
-        <w:t>Anchor Links in README:</w:t>
-      </w:r>
-    </w:p>
-    <w:p>
-      <w:pPr>
-        <w:jc w:val="both"/>
-        <w:rPr>
-          <w:color w:val="000000" w:themeColor="text1"/>
-          <w:sz w:val="32"/>
-          <w:szCs w:val="32"/>
-        </w:rPr>
-      </w:pPr>
-      <w:r>
-        <w:rPr>
-          <w:color w:val="000000" w:themeColor="text1"/>
-          <w:sz w:val="32"/>
-          <w:szCs w:val="32"/>
-        </w:rPr>
         <w:t># For table of contents</w:t>
       </w:r>
     </w:p>
@@ -5281,7 +5302,6 @@
           <w:sz w:val="32"/>
           <w:szCs w:val="32"/>
         </w:rPr>
-        <w:lastRenderedPageBreak/>
         <w:t>- [Install](#install)</w:t>
       </w:r>
     </w:p>
@@ -5921,6 +5941,7 @@
           <w:sz w:val="32"/>
           <w:szCs w:val="32"/>
         </w:rPr>
+        <w:lastRenderedPageBreak/>
         <w:t xml:space="preserve"># </w:t>
       </w:r>
       <w:r>
@@ -5951,7 +5972,6 @@
           <w:sz w:val="32"/>
           <w:szCs w:val="32"/>
         </w:rPr>
-        <w:lastRenderedPageBreak/>
         <w:t xml:space="preserve">git checkout </w:t>
       </w:r>
       <w:proofErr w:type="spellStart"/>
@@ -6694,7 +6714,6 @@
           <w:sz w:val="32"/>
           <w:szCs w:val="32"/>
         </w:rPr>
-        <w:lastRenderedPageBreak/>
         <w:t>More Basics:</w:t>
       </w:r>
     </w:p>

</xml_diff>